<commit_message>
Case study "Was the promo worth it?" (five-minute, step by step), CV updated for Shelly v2.5 (Word, PDF and web), home page figures refreshed
Co-Authored-By: Claude Opus 5.5 <noreply@anthropic.com>
Claude-Session: https://claude.ai/code/session_01VXjp7DwK3tLyLAJcafn74e
</commit_message>
<xml_diff>
--- a/Pavithra_Bamunu_CV_Master.docx
+++ b/Pavithra_Bamunu_CV_Master.docx
@@ -196,7 +196,7 @@
         <w:t xml:space="preserve">Shelly, an analytics agent  </w:t>
       </w:r>
       <w:r>
-        <w:t>I built and published open-source — a CRISP-DM pipeline plus a report engine that writes Excel workbooks with live formulas and PivotTables from a plain-English request; 38 automated tests, continuous integration green, reproducible in 23 seconds from a clean clone</w:t>
+        <w:t>I built and published open-source — a CRISP-DM pipeline plus a report engine that writes Excel workbooks with live formulas and PivotTables from a plain-English request, and a commercial lab that scored 317 promotions against their baseline (only 5% paid their way); 140+ automated tests, reproducible from a clean clone</w:t>
       </w:r>
     </w:p>
     <w:p>
@@ -1679,7 +1679,7 @@
                 <w:sz w:val="21"/>
                 <w:szCs w:val="21"/>
               </w:rPr>
-              <w:t>Shelly — Analytics Agent v1.1 (open source)</w:t>
+              <w:t>Shelly — Analytics Agent v2.5 (open source)</w:t>
             </w:r>
           </w:p>
         </w:tc>
@@ -1788,7 +1788,23 @@
         <w:t xml:space="preserve">–  </w:t>
       </w:r>
       <w:r>
-        <w:t>Extended to twenty-four skills across six industry packs and a second module modelling a medical importer’s supply chain — stock-out and expiry risk, supplier scorecard and client segments. Published with 38 automated tests and continuous integration; synthetic data only, and no employer data of any kind is used</w:t>
+        <w:t>Built a commercial lab that scored 317 grocery promotions against a same-weekday baseline, net of cannibalisation and the after-promo dip: shoppers bought 47% more, but only 5% of promos paid their way, mostly through the discount on units that would have sold anyway. Sized the supplier funding each promotion needs with a discount-depth model, and added basket lift analysis</w:t>
+      </w:r>
+    </w:p>
+    <w:p>
+      <w:pPr>
+        <w:spacing w:after="50"/>
+        <w:ind w:left="300" w:hanging="170"/>
+        <w:jc w:val="both"/>
+      </w:pPr>
+      <w:r>
+        <w:rPr>
+          <w:color w:val="8C8C8C"/>
+        </w:rPr>
+        <w:t xml:space="preserve">–  </w:t>
+      </w:r>
+      <w:r>
+        <w:t>Extended to 66 skills across four synthetic businesses: a store, a medical importer (stock-out and expiry risk, supplier scorecard, client segments), a 3PL, and a head-office tower with a clinic and a hotel. Published with 140+ automated tests and continuous integration; synthetic data only, and no employer data of any kind is used</w:t>
       </w:r>
     </w:p>
     <w:tbl>

</xml_diff>